<commit_message>
Use the real addresses: middleware 10.0.0.86:8080, SAP DEV 10.0.0.38
Deployment guide address table, firewall RemoteAddress and install
command; ABAP spec SM59 / network rows (markdown, Word and shared doc);
Postman baseUrl default; README note.

Co-Authored-By: Claude Fable 5.1 <noreply@anthropic.com>
</commit_message>
<xml_diff>
--- a/docs/SAP-ABAP-Interface-Spec.docx
+++ b/docs/SAP-ABAP-Interface-Spec.docx
@@ -182,7 +182,7 @@
     <w:p>
       <w:pPr/>
       <w:r>
-        <w:t xml:space="preserve">SAP calls the middleware, never PRAL. The host and port come from the SM59 destination; only the path differs per environment.</w:t>
+        <w:t xml:space="preserve">SAP calls the middleware, never PRAL. The host and port come from the SM59 destination: middleware server 10.0.0.86, port 8080 (plain HTTP during development; HTTPS on 443 once TLS is set up on the server). Only the path differs per environment. Example: http://10.0.0.86:8080/api/v1/dev/invoices.</w:t>
       </w:r>
     </w:p>
     <w:tbl>
@@ -9562,7 +9562,52 @@
           <w:p>
             <w:pPr/>
             <w:r>
-              <w:t xml:space="preserve">type G (HTTP to external server), host and port of the middleware (443 behind IIS), SSL active, path prefix empty. One destination per environment is not needed; the path chooses the environment. Timeout 200 s.</w:t>
+              <w:t xml:space="preserve">type G (HTTP to external server), target host </w:t>
+            </w:r>
+            <w:r>
+              <w:rPr>
+                <w:rStyle w:val="CodeChar"/>
+              </w:rPr>
+              <w:t xml:space="preserve">10.0.0.86</w:t>
+            </w:r>
+            <w:r>
+              <w:t xml:space="preserve">, service no. </w:t>
+            </w:r>
+            <w:r>
+              <w:rPr>
+                <w:rStyle w:val="CodeChar"/>
+              </w:rPr>
+              <w:t xml:space="preserve">8080</w:t>
+            </w:r>
+            <w:r>
+              <w:t xml:space="preserve"> (later 443 with SSL active when TLS is in place), path prefix empty. Created on SAP DEV (</w:t>
+            </w:r>
+            <w:r>
+              <w:rPr>
+                <w:rStyle w:val="CodeChar"/>
+              </w:rPr>
+              <w:t xml:space="preserve">10.0.0.38</w:t>
+            </w:r>
+            <w:r>
+              <w:t xml:space="preserve">, SID DEV, instance 00) first; the same destination definition is transported to QAS/PRD. One destination per PRAL environment is not needed; the URL path chooses </w:t>
+            </w:r>
+            <w:r>
+              <w:rPr>
+                <w:rStyle w:val="CodeChar"/>
+              </w:rPr>
+              <w:t xml:space="preserve">dev</w:t>
+            </w:r>
+            <w:r>
+              <w:t xml:space="preserve"> or </w:t>
+            </w:r>
+            <w:r>
+              <w:rPr>
+                <w:rStyle w:val="CodeChar"/>
+              </w:rPr>
+              <w:t xml:space="preserve">prd</w:t>
+            </w:r>
+            <w:r>
+              <w:t xml:space="preserve">. Timeout 200 s.</w:t>
             </w:r>
           </w:p>
         </w:tc>
@@ -9586,7 +9631,7 @@
           <w:p>
             <w:pPr/>
             <w:r>
-              <w:t xml:space="preserve">import the middleware's TLS certificate chain into the SSL client (Anonymous or Standard) PSE used by the destination</w:t>
+              <w:t xml:space="preserve">import the middleware's TLS certificate chain into the SSL client (Anonymous or Standard) PSE used by the destination, once HTTPS is enabled</w:t>
             </w:r>
           </w:p>
         </w:tc>
@@ -9610,7 +9655,25 @@
           <w:p>
             <w:pPr/>
             <w:r>
-              <w:t xml:space="preserve">SAP application servers must reach the middleware host on the chosen port; the middleware firewall rule allows only those IPs</w:t>
+              <w:t xml:space="preserve">the SAP application server (DEV: </w:t>
+            </w:r>
+            <w:r>
+              <w:rPr>
+                <w:rStyle w:val="CodeChar"/>
+              </w:rPr>
+              <w:t xml:space="preserve">10.0.0.38</w:t>
+            </w:r>
+            <w:r>
+              <w:t xml:space="preserve">) must reach </w:t>
+            </w:r>
+            <w:r>
+              <w:rPr>
+                <w:rStyle w:val="CodeChar"/>
+              </w:rPr>
+              <w:t xml:space="preserve">10.0.0.86:8080</w:t>
+            </w:r>
+            <w:r>
+              <w:t xml:space="preserve">; the middleware firewall allows only listed SAP server addresses, so QAS/PRD servers must be added before they go live</w:t>
             </w:r>
           </w:p>
         </w:tc>

</xml_diff>

<commit_message>
Document PRAL's real 401 fault body; mock returns the same shape
Captured from the deployed middleware against the PRAL sandbox gateway:
HTTP 401 with {"fault": {"code": 900901, "message": "Invalid
Credentials", ...}}. Added as section 6.7 of the ABAP spec (markdown,
Word, shared doc), a sample file, and the mock PRAL's 401 response.

Co-Authored-By: Claude Fable 5.1 <noreply@anthropic.com>
</commit_message>
<xml_diff>
--- a/docs/SAP-ABAP-Interface-Spec.docx
+++ b/docs/SAP-ABAP-Interface-Spec.docx
@@ -7982,7 +7982,7 @@
           <w:p>
             <w:pPr/>
             <w:r>
-              <w:t xml:space="preserve">PRAL returned 401 or error 0401 / 0402: token invalid, expired or not bound to this NTN</w:t>
+              <w:t xml:space="preserve">PRAL returned 401 (gateway fault 900901 Invalid Credentials in pralResponse.fault, see 6.7) or error 0401 / 0402: token invalid, expired or not bound to this NTN</w:t>
             </w:r>
           </w:p>
         </w:tc>
@@ -8332,6 +8332,89 @@
       <w:bookmarkEnd w:id="6"/>
       <w:r>
         <w:t xml:space="preserve">{ "detail": "Missing Authorization: Bearer header" }</w:t>
+      </w:r>
+    </w:p>
+    <w:p>
+      <w:pPr>
+        <w:pStyle w:val="Heading3"/>
+      </w:pPr>
+      <w:r>
+        <w:t xml:space="preserve">6.7 Token rejected by PRAL, HTTP 502</w:t>
+      </w:r>
+    </w:p>
+    <w:p>
+      <w:pPr/>
+      <w:r>
+        <w:t xml:space="preserve">Observed from the deployed middleware against the real PRAL sandbox gateway. PRAL answers HTTP 401 with a gateway fault, not a </w:t>
+      </w:r>
+      <w:r>
+        <w:rPr>
+          <w:rStyle w:val="CodeChar"/>
+        </w:rPr>
+        <w:t xml:space="preserve">validationResponse</w:t>
+      </w:r>
+      <w:r>
+        <w:t xml:space="preserve">; the middleware maps it to </w:t>
+      </w:r>
+      <w:r>
+        <w:rPr>
+          <w:rStyle w:val="CodeChar"/>
+        </w:rPr>
+        <w:t xml:space="preserve">AUTH_ERROR</w:t>
+      </w:r>
+      <w:r>
+        <w:t xml:space="preserve"> and returns the fault verbatim:</w:t>
+      </w:r>
+    </w:p>
+    <w:p>
+      <w:pPr>
+        <w:pStyle w:val="Code"/>
+      </w:pPr>
+      <w:bookmarkStart w:id="7" w:name="bongo_lang_json_7"/>
+      <w:bookmarkEnd w:id="7"/>
+      <w:r>
+        <w:t xml:space="preserve">{</w:t>
+        <w:br/>
+        <w:t xml:space="preserve">  "status": "AUTH_ERROR",</w:t>
+        <w:br/>
+        <w:t xml:space="preserve">  "fbrInvoiceNo": null,</w:t>
+        <w:br/>
+        <w:t xml:space="preserve">  "pralHttpStatus": 401,</w:t>
+        <w:br/>
+        <w:t xml:space="preserve">  "pralResponse": {</w:t>
+        <w:br/>
+        <w:t xml:space="preserve">    "fault": {</w:t>
+        <w:br/>
+        <w:t xml:space="preserve">      "code": 900901,</w:t>
+        <w:br/>
+        <w:t xml:space="preserve">      "message": "Invalid Credentials",</w:t>
+        <w:br/>
+        <w:t xml:space="preserve">      "description": "Access failure for API: /di_data/v1, version: v1 status: (900901) - Invalid Credentials. Make sure you have given the correct access token"</w:t>
+        <w:br/>
+        <w:t xml:space="preserve">    }</w:t>
+        <w:br/>
+        <w:t xml:space="preserve">  },</w:t>
+        <w:br/>
+        <w:t xml:space="preserve">  "errorDescriptions": [],</w:t>
+        <w:br/>
+        <w:t xml:space="preserve">  "attempts": 1</w:t>
+        <w:br/>
+        <w:t xml:space="preserve">}</w:t>
+      </w:r>
+    </w:p>
+    <w:p>
+      <w:pPr/>
+      <w:r>
+        <w:t xml:space="preserve">SAP action: do not retry; the token in </w:t>
+      </w:r>
+      <w:r>
+        <w:rPr>
+          <w:rStyle w:val="CodeChar"/>
+        </w:rPr>
+        <w:t xml:space="preserve">ZFBR_TOKEN</w:t>
+      </w:r>
+      <w:r>
+        <w:t xml:space="preserve"> for this seller and environment is wrong, expired, or issued for the other environment. Fix it, then resubmit.</w:t>
       </w:r>
     </w:p>
     <w:p>

</xml_diff>

<commit_message>
Middleware port is 8003 on the PRL server
LISTEN_PORT changed to 8003 (firewall rule updated, service restarted,
health ok). Every reference moved from 8080 to 8003: deployment guide,
ABAP spec (markdown, Word, shared doc), both Postman collections and the
environment, README, .env.example note, pre-flight default and candidate
order. Proxy examples keep their own port numbers.

Co-Authored-By: Claude Fable 5.1 <noreply@anthropic.com>
</commit_message>
<xml_diff>
--- a/docs/SAP-ABAP-Interface-Spec.docx
+++ b/docs/SAP-ABAP-Interface-Spec.docx
@@ -182,7 +182,7 @@
     <w:p>
       <w:pPr/>
       <w:r>
-        <w:t xml:space="preserve">SAP calls the middleware, never PRAL. The host and port come from the SM59 destination: middleware server 10.0.0.86, port 8080 (plain HTTP during development; HTTPS on 443 once TLS is set up on the server). Only the path differs per environment. Example: http://10.0.0.86:8080/api/v1/dev/invoices.</w:t>
+        <w:t xml:space="preserve">SAP calls the middleware, never PRAL. The host and port come from the SM59 destination: middleware server 10.0.0.86, port 8003 (plain HTTP during development; HTTPS on 443 once TLS is set up on the server). Only the path differs per environment. Example: http://10.0.0.86:8003/api/v1/dev/invoices.</w:t>
       </w:r>
     </w:p>
     <w:tbl>
@@ -646,7 +646,65 @@
           <w:p>
             <w:pPr/>
             <w:r>
-              <w:t xml:space="preserve">Liveness; useful from SM59 connection test</w:t>
+              <w:t xml:space="preserve">Liveness: DB check, in-flight count, PRAL URLs</w:t>
+            </w:r>
+          </w:p>
+        </w:tc>
+      </w:tr>
+      <w:tr>
+        <w:tc>
+          <w:tcPr>
+            <w:tcW w:w="2340" w:type="dxa"/>
+          </w:tcPr>
+          <w:p>
+            <w:pPr/>
+            <w:r>
+              <w:t xml:space="preserve">GET</w:t>
+            </w:r>
+          </w:p>
+        </w:tc>
+        <w:tc>
+          <w:tcPr>
+            <w:tcW w:w="2340" w:type="dxa"/>
+          </w:tcPr>
+          <w:p>
+            <w:pPr/>
+            <w:r>
+              <w:rPr>
+                <w:rStyle w:val="CodeChar"/>
+              </w:rPr>
+              <w:t xml:space="preserve">/</w:t>
+            </w:r>
+          </w:p>
+        </w:tc>
+        <w:tc>
+          <w:tcPr>
+            <w:tcW w:w="2340" w:type="dxa"/>
+          </w:tcPr>
+          <w:p>
+            <w:pPr/>
+            <w:r>
+              <w:t xml:space="preserve">none</w:t>
+            </w:r>
+          </w:p>
+        </w:tc>
+        <w:tc>
+          <w:tcPr>
+            <w:tcW w:w="2340" w:type="dxa"/>
+          </w:tcPr>
+          <w:p>
+            <w:pPr/>
+            <w:r>
+              <w:t xml:space="preserve">Answers 200 with the service name, so the SM59 "Connection Test" button (which calls </w:t>
+            </w:r>
+            <w:r>
+              <w:rPr>
+                <w:rStyle w:val="CodeChar"/>
+              </w:rPr>
+              <w:t xml:space="preserve">/</w:t>
+            </w:r>
+            <w:r>
+              <w:t xml:space="preserve">) shows success</w:t>
             </w:r>
           </w:p>
         </w:tc>
@@ -9660,10 +9718,10 @@
               <w:rPr>
                 <w:rStyle w:val="CodeChar"/>
               </w:rPr>
-              <w:t xml:space="preserve">8080</w:t>
-            </w:r>
-            <w:r>
-              <w:t xml:space="preserve"> (later 443 with SSL active when TLS is in place), path prefix empty. Created on SAP DEV (</w:t>
+              <w:t xml:space="preserve">8003</w:t>
+            </w:r>
+            <w:r>
+              <w:t xml:space="preserve">, path prefix empty, SSL inactive (HTTP on the internal network by decision; revisit before production). Created on SAP DEV (</w:t>
             </w:r>
             <w:r>
               <w:rPr>
@@ -9714,7 +9772,7 @@
           <w:p>
             <w:pPr/>
             <w:r>
-              <w:t xml:space="preserve">import the middleware's TLS certificate chain into the SSL client (Anonymous or Standard) PSE used by the destination, once HTTPS is enabled</w:t>
+              <w:t xml:space="preserve">nothing while HTTP is used; once HTTPS is enabled, import the middleware's TLS certificate chain into the SSL client (Anonymous or Standard) PSE used by the destination</w:t>
             </w:r>
           </w:p>
         </w:tc>
@@ -9753,7 +9811,7 @@
               <w:rPr>
                 <w:rStyle w:val="CodeChar"/>
               </w:rPr>
-              <w:t xml:space="preserve">10.0.0.86:8080</w:t>
+              <w:t xml:space="preserve">10.0.0.86:8003</w:t>
             </w:r>
             <w:r>
               <w:t xml:space="preserve">; the middleware firewall allows only listed SAP server addresses, so QAS/PRD servers must be added before they go live</w:t>

</xml_diff>